<commit_message>
modifique archivos de proyectos
</commit_message>
<xml_diff>
--- a/TFI Economia/Instalacion de sensores VF.docx
+++ b/TFI Economia/Instalacion de sensores VF.docx
@@ -1,6 +1,6 @@
 
 <file path=word/document.xml><?xml version="1.0" encoding="utf-8"?>
-<w:document xmlns:wpc="http://schemas.microsoft.com/office/word/2010/wordprocessingCanvas" xmlns:cx="http://schemas.microsoft.com/office/drawing/2014/chartex" xmlns:cx1="http://schemas.microsoft.com/office/drawing/2015/9/8/chartex" xmlns:mc="http://schemas.openxmlformats.org/markup-compatibility/2006" xmlns:o="urn:schemas-microsoft-com:office:office" xmlns:r="http://schemas.openxmlformats.org/officeDocument/2006/relationships" xmlns:m="http://schemas.openxmlformats.org/officeDocument/2006/math" xmlns:v="urn:schemas-microsoft-com:vml" xmlns:wp14="http://schemas.microsoft.com/office/word/2010/wordprocessingDrawing" xmlns:wp="http://schemas.openxmlformats.org/drawingml/2006/wordprocessingDrawing" xmlns:w10="urn:schemas-microsoft-com:office:word" xmlns:w="http://schemas.openxmlformats.org/wordprocessingml/2006/main" xmlns:w14="http://schemas.microsoft.com/office/word/2010/wordml" xmlns:w15="http://schemas.microsoft.com/office/word/2012/wordml" xmlns:w16se="http://schemas.microsoft.com/office/word/2015/wordml/symex" xmlns:wpg="http://schemas.microsoft.com/office/word/2010/wordprocessingGroup" xmlns:wpi="http://schemas.microsoft.com/office/word/2010/wordprocessingInk" xmlns:wne="http://schemas.microsoft.com/office/word/2006/wordml" xmlns:wps="http://schemas.microsoft.com/office/word/2010/wordprocessingShape" mc:Ignorable="w14 w15 w16se wp14">
+<w:document xmlns:wpc="http://schemas.microsoft.com/office/word/2010/wordprocessingCanvas" xmlns:cx="http://schemas.microsoft.com/office/drawing/2014/chartex" xmlns:cx1="http://schemas.microsoft.com/office/drawing/2015/9/8/chartex" xmlns:cx2="http://schemas.microsoft.com/office/drawing/2015/10/21/chartex" xmlns:cx3="http://schemas.microsoft.com/office/drawing/2016/5/9/chartex" xmlns:cx4="http://schemas.microsoft.com/office/drawing/2016/5/10/chartex" xmlns:cx5="http://schemas.microsoft.com/office/drawing/2016/5/11/chartex" xmlns:cx6="http://schemas.microsoft.com/office/drawing/2016/5/12/chartex" xmlns:cx7="http://schemas.microsoft.com/office/drawing/2016/5/13/chartex" xmlns:cx8="http://schemas.microsoft.com/office/drawing/2016/5/14/chartex" xmlns:mc="http://schemas.openxmlformats.org/markup-compatibility/2006" xmlns:aink="http://schemas.microsoft.com/office/drawing/2016/ink" xmlns:am3d="http://schemas.microsoft.com/office/drawing/2017/model3d" xmlns:o="urn:schemas-microsoft-com:office:office" xmlns:oel="http://schemas.microsoft.com/office/2019/extlst" xmlns:r="http://schemas.openxmlformats.org/officeDocument/2006/relationships" xmlns:m="http://schemas.openxmlformats.org/officeDocument/2006/math" xmlns:v="urn:schemas-microsoft-com:vml" xmlns:wp14="http://schemas.microsoft.com/office/word/2010/wordprocessingDrawing" xmlns:wp="http://schemas.openxmlformats.org/drawingml/2006/wordprocessingDrawing" xmlns:w10="urn:schemas-microsoft-com:office:word" xmlns:w="http://schemas.openxmlformats.org/wordprocessingml/2006/main" xmlns:w14="http://schemas.microsoft.com/office/word/2010/wordml" xmlns:w15="http://schemas.microsoft.com/office/word/2012/wordml" xmlns:w16cex="http://schemas.microsoft.com/office/word/2018/wordml/cex" xmlns:w16cid="http://schemas.microsoft.com/office/word/2016/wordml/cid" xmlns:w16="http://schemas.microsoft.com/office/word/2018/wordml" xmlns:w16du="http://schemas.microsoft.com/office/word/2023/wordml/word16du" xmlns:w16sdtdh="http://schemas.microsoft.com/office/word/2020/wordml/sdtdatahash" xmlns:w16sdtfl="http://schemas.microsoft.com/office/word/2024/wordml/sdtformatlock" xmlns:w16se="http://schemas.microsoft.com/office/word/2015/wordml/symex" xmlns:wpg="http://schemas.microsoft.com/office/word/2010/wordprocessingGroup" xmlns:wpi="http://schemas.microsoft.com/office/word/2010/wordprocessingInk" xmlns:wne="http://schemas.microsoft.com/office/word/2006/wordml" xmlns:wps="http://schemas.microsoft.com/office/word/2010/wordprocessingShape" mc:Ignorable="w14 w15 w16se w16cid w16 w16cex w16sdtdh w16sdtfl w16du wp14">
   <w:body>
     <w:sdt>
       <w:sdtPr>
@@ -14,7 +14,6 @@
           <w:docPartUnique/>
         </w:docPartObj>
       </w:sdtPr>
-      <w:sdtEndPr/>
       <w:sdtContent>
         <w:p>
           <w:pPr>
@@ -28,7 +27,7 @@
             <mc:AlternateContent>
               <mc:Choice Requires="wpg">
                 <w:drawing>
-                  <wp:anchor distT="0" distB="0" distL="114300" distR="114300" simplePos="0" relativeHeight="251651072" behindDoc="1" locked="0" layoutInCell="1" allowOverlap="1">
+                  <wp:anchor distT="0" distB="0" distL="114300" distR="114300" simplePos="0" relativeHeight="251651072" behindDoc="1" locked="0" layoutInCell="1" allowOverlap="1" wp14:anchorId="700FC7D6" wp14:editId="28725C1F">
                     <wp:simplePos x="0" y="0"/>
                     <wp:positionH relativeFrom="page">
                       <wp:posOffset>297815</wp:posOffset>
@@ -145,7 +144,6 @@
                                       <w:calendar w:val="gregorian"/>
                                     </w:date>
                                   </w:sdtPr>
-                                  <w:sdtEndPr/>
                                   <w:sdtContent>
                                     <w:p>
                                       <w:pPr>
@@ -3448,7 +3446,7 @@
               </mc:Choice>
               <mc:Fallback>
                 <w:pict>
-                  <v:group id="Grupo 2" o:spid="_x0000_s1026" style="position:absolute;margin-left:23.45pt;margin-top:20.3pt;width:172.8pt;height:718.55pt;z-index:-251665408;mso-width-percent:330;mso-height-percent:950;mso-position-horizontal-relative:page;mso-position-vertical-relative:page;mso-width-percent:330;mso-height-percent:950" coordsize="21945,91257" o:gfxdata="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">
+                  <v:group w14:anchorId="700FC7D6" id="Grupo 2" o:spid="_x0000_s1026" style="position:absolute;margin-left:23.45pt;margin-top:20.3pt;width:172.8pt;height:718.55pt;z-index:-251665408;mso-width-percent:330;mso-height-percent:950;mso-position-horizontal-relative:page;mso-position-vertical-relative:page;mso-width-percent:330;mso-height-percent:950" coordsize="21945,91257" o:gfxdata="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">
                     <v:rect id="Rectángulo 3" o:spid="_x0000_s1027" style="position:absolute;width:1945;height:91257;visibility:visible;mso-wrap-style:square;v-text-anchor:middle" o:gfxdata="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" fillcolor="#44546a [3215]" stroked="f" strokeweight="1pt"/>
                     <v:shapetype id="_x0000_t15" coordsize="21600,21600" o:spt="15" adj="16200" path="m@0,l,,,21600@0,21600,21600,10800xe">
                       <v:stroke joinstyle="miter"/>
@@ -3482,7 +3480,6 @@
                                 <w:calendar w:val="gregorian"/>
                               </w:date>
                             </w:sdtPr>
-                            <w:sdtEndPr/>
                             <w:sdtContent>
                               <w:p>
                                 <w:pPr>
@@ -3645,7 +3642,7 @@
             <mc:AlternateContent>
               <mc:Choice Requires="wps">
                 <w:drawing>
-                  <wp:anchor distT="45720" distB="45720" distL="114300" distR="114300" simplePos="0" relativeHeight="251655168" behindDoc="0" locked="0" layoutInCell="1" allowOverlap="1">
+                  <wp:anchor distT="45720" distB="45720" distL="114300" distR="114300" simplePos="0" relativeHeight="251655168" behindDoc="0" locked="0" layoutInCell="1" allowOverlap="1" wp14:anchorId="4644E302" wp14:editId="5BC5A415">
                     <wp:simplePos x="0" y="0"/>
                     <wp:positionH relativeFrom="column">
                       <wp:posOffset>-567843</wp:posOffset>
@@ -3749,11 +3746,11 @@
               </mc:Choice>
               <mc:Fallback>
                 <w:pict>
-                  <v:shapetype id="_x0000_t202" coordsize="21600,21600" o:spt="202" path="m,l,21600r21600,l21600,xe">
+                  <v:shapetype w14:anchorId="4644E302" id="_x0000_t202" coordsize="21600,21600" o:spt="202" path="m,l,21600r21600,l21600,xe">
                     <v:stroke joinstyle="miter"/>
                     <v:path gradientshapeok="t" o:connecttype="rect"/>
                   </v:shapetype>
-                  <v:shape id="Cuadro de texto 2" o:spid="_x0000_s1055" type="#_x0000_t202" style="position:absolute;margin-left:-44.7pt;margin-top:.05pt;width:553.3pt;height:110.6pt;z-index:251655168;visibility:visible;mso-wrap-style:square;mso-width-percent:0;mso-height-percent:200;mso-wrap-distance-left:9pt;mso-wrap-distance-top:3.6pt;mso-wrap-distance-right:9pt;mso-wrap-distance-bottom:3.6pt;mso-position-horizontal:absolute;mso-position-horizontal-relative:text;mso-position-vertical:absolute;mso-position-vertical-relative:text;mso-width-percent:0;mso-height-percent:200;mso-width-relative:margin;mso-height-relative:margin;v-text-anchor:top" o:gfxdata="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">
+                  <v:shape id="Cuadro de texto 2" o:spid="_x0000_s1055" type="#_x0000_t202" style="position:absolute;margin-left:-44.7pt;margin-top:.05pt;width:553.3pt;height:110.6pt;z-index:251655168;visibility:visible;mso-wrap-style:square;mso-width-percent:0;mso-height-percent:200;mso-wrap-distance-left:9pt;mso-wrap-distance-top:3.6pt;mso-wrap-distance-right:9pt;mso-wrap-distance-bottom:3.6pt;mso-position-horizontal:absolute;mso-position-horizontal-relative:text;mso-position-vertical:absolute;mso-position-vertical-relative:text;mso-width-percent:0;mso-height-percent:200;mso-width-relative:margin;mso-height-relative:margin;v-text-anchor:top" o:gfxdata="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">
                     <v:textbox style="mso-fit-shape-to-text:t">
                       <w:txbxContent>
                         <w:p>
@@ -3816,7 +3813,7 @@
             <mc:AlternateContent>
               <mc:Choice Requires="wps">
                 <w:drawing>
-                  <wp:anchor distT="91440" distB="91440" distL="114300" distR="114300" simplePos="0" relativeHeight="251657216" behindDoc="0" locked="0" layoutInCell="1" allowOverlap="1">
+                  <wp:anchor distT="91440" distB="91440" distL="114300" distR="114300" simplePos="0" relativeHeight="251657216" behindDoc="0" locked="0" layoutInCell="1" allowOverlap="1" wp14:anchorId="4834AA19" wp14:editId="276E4D36">
                     <wp:simplePos x="0" y="0"/>
                     <wp:positionH relativeFrom="page">
                       <wp:posOffset>2798445</wp:posOffset>
@@ -3878,7 +3875,7 @@
                                     <w:sz w:val="32"/>
                                     <w:szCs w:val="32"/>
                                   </w:rPr>
-                                  <w:t>Integrantes: Madozzo, Bruno                       44528</w:t>
+                                  <w:t xml:space="preserve">Integrantes: Madozzo, Bruno                       </w:t>
                                 </w:r>
                               </w:p>
                               <w:p>
@@ -3904,7 +3901,7 @@
                                     <w:sz w:val="32"/>
                                     <w:szCs w:val="32"/>
                                   </w:rPr>
-                                  <w:t xml:space="preserve">                      Molina, Santiago                      43695</w:t>
+                                  <w:t xml:space="preserve">                      Molina, Santiago                      </w:t>
                                 </w:r>
                               </w:p>
                               <w:p>
@@ -3930,7 +3927,7 @@
                                     <w:sz w:val="32"/>
                                     <w:szCs w:val="32"/>
                                   </w:rPr>
-                                  <w:t xml:space="preserve">                     Ochoa, José                                49759</w:t>
+                                  <w:t xml:space="preserve">                     Ochoa, José                                </w:t>
                                 </w:r>
                               </w:p>
                               <w:p>
@@ -3956,7 +3953,7 @@
                                     <w:sz w:val="32"/>
                                     <w:szCs w:val="32"/>
                                   </w:rPr>
-                                  <w:t xml:space="preserve">                     Serrillo, Cristian Damián          47766</w:t>
+                                  <w:t xml:space="preserve">                     Serrillo, Cristian Damián         </w:t>
                                 </w:r>
                               </w:p>
                               <w:p>
@@ -4000,7 +3997,7 @@
               </mc:Choice>
               <mc:Fallback>
                 <w:pict>
-                  <v:shape id="_x0000_s1056" type="#_x0000_t202" style="position:absolute;margin-left:220.35pt;margin-top:417.95pt;width:350.6pt;height:110.55pt;z-index:251657216;visibility:visible;mso-wrap-style:square;mso-width-percent:0;mso-height-percent:200;mso-wrap-distance-left:9pt;mso-wrap-distance-top:7.2pt;mso-wrap-distance-right:9pt;mso-wrap-distance-bottom:7.2pt;mso-position-horizontal:absolute;mso-position-horizontal-relative:page;mso-position-vertical:absolute;mso-position-vertical-relative:text;mso-width-percent:0;mso-height-percent:200;mso-width-relative:margin;mso-height-relative:margin;v-text-anchor:top" o:gfxdata="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" filled="f" stroked="f">
+                  <v:shape w14:anchorId="4834AA19" id="_x0000_s1056" type="#_x0000_t202" style="position:absolute;margin-left:220.35pt;margin-top:417.95pt;width:350.6pt;height:110.55pt;z-index:251657216;visibility:visible;mso-wrap-style:square;mso-width-percent:0;mso-height-percent:200;mso-wrap-distance-left:9pt;mso-wrap-distance-top:7.2pt;mso-wrap-distance-right:9pt;mso-wrap-distance-bottom:7.2pt;mso-position-horizontal:absolute;mso-position-horizontal-relative:page;mso-position-vertical:absolute;mso-position-vertical-relative:text;mso-width-percent:0;mso-height-percent:200;mso-width-relative:margin;mso-height-relative:margin;v-text-anchor:top" o:gfxdata="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" filled="f" stroked="f">
                     <v:textbox style="mso-fit-shape-to-text:t">
                       <w:txbxContent>
                         <w:p>
@@ -4026,7 +4023,7 @@
                               <w:sz w:val="32"/>
                               <w:szCs w:val="32"/>
                             </w:rPr>
-                            <w:t>Integrantes: Madozzo, Bruno                       44528</w:t>
+                            <w:t xml:space="preserve">Integrantes: Madozzo, Bruno                       </w:t>
                           </w:r>
                         </w:p>
                         <w:p>
@@ -4052,7 +4049,7 @@
                               <w:sz w:val="32"/>
                               <w:szCs w:val="32"/>
                             </w:rPr>
-                            <w:t xml:space="preserve">                      Molina, Santiago                      43695</w:t>
+                            <w:t xml:space="preserve">                      Molina, Santiago                      </w:t>
                           </w:r>
                         </w:p>
                         <w:p>
@@ -4078,7 +4075,7 @@
                               <w:sz w:val="32"/>
                               <w:szCs w:val="32"/>
                             </w:rPr>
-                            <w:t xml:space="preserve">                     Ochoa, José                                49759</w:t>
+                            <w:t xml:space="preserve">                     Ochoa, José                                </w:t>
                           </w:r>
                         </w:p>
                         <w:p>
@@ -4104,7 +4101,7 @@
                               <w:sz w:val="32"/>
                               <w:szCs w:val="32"/>
                             </w:rPr>
-                            <w:t xml:space="preserve">                     Serrillo, Cristian Damián          47766</w:t>
+                            <w:t xml:space="preserve">                     Serrillo, Cristian Damián         </w:t>
                           </w:r>
                         </w:p>
                         <w:p>
@@ -4145,7 +4142,7 @@
             <mc:AlternateContent>
               <mc:Choice Requires="wps">
                 <w:drawing>
-                  <wp:anchor distT="0" distB="0" distL="114300" distR="114300" simplePos="0" relativeHeight="251653120" behindDoc="0" locked="0" layoutInCell="1" allowOverlap="1">
+                  <wp:anchor distT="0" distB="0" distL="114300" distR="114300" simplePos="0" relativeHeight="251653120" behindDoc="0" locked="0" layoutInCell="1" allowOverlap="1" wp14:anchorId="4D94D913" wp14:editId="62587A2D">
                     <wp:simplePos x="0" y="0"/>
                     <wp:positionH relativeFrom="page">
                       <wp:posOffset>3175635</wp:posOffset>
@@ -4219,7 +4216,6 @@
                                     <w:dataBinding w:prefixMappings="xmlns:ns0='http://purl.org/dc/elements/1.1/' xmlns:ns1='http://schemas.openxmlformats.org/package/2006/metadata/core-properties' " w:xpath="/ns1:coreProperties[1]/ns0:title[1]" w:storeItemID="{6C3C8BC8-F283-45AE-878A-BAB7291924A1}"/>
                                     <w:text/>
                                   </w:sdtPr>
-                                  <w:sdtEndPr/>
                                   <w:sdtContent>
                                     <w:r>
                                       <w:rPr>
@@ -4275,7 +4271,7 @@
               </mc:Choice>
               <mc:Fallback>
                 <w:pict>
-                  <v:shape id="Cuadro de texto 1" o:spid="_x0000_s1057" type="#_x0000_t202" style="position:absolute;margin-left:250.05pt;margin-top:249.75pt;width:312.75pt;height:107.25pt;z-index:251653120;visibility:visible;mso-wrap-style:square;mso-width-percent:0;mso-height-percent:0;mso-wrap-distance-left:9pt;mso-wrap-distance-top:0;mso-wrap-distance-right:9pt;mso-wrap-distance-bottom:0;mso-position-horizontal:absolute;mso-position-horizontal-relative:page;mso-position-vertical:absolute;mso-position-vertical-relative:page;mso-width-percent:0;mso-height-percent:0;mso-width-relative:page;mso-height-relative:margin;v-text-anchor:top" o:gfxdata="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" filled="f" stroked="f" strokeweight=".5pt">
+                  <v:shape w14:anchorId="4D94D913" id="Cuadro de texto 1" o:spid="_x0000_s1057" type="#_x0000_t202" style="position:absolute;margin-left:250.05pt;margin-top:249.75pt;width:312.75pt;height:107.25pt;z-index:251653120;visibility:visible;mso-wrap-style:square;mso-width-percent:0;mso-height-percent:0;mso-wrap-distance-left:9pt;mso-wrap-distance-top:0;mso-wrap-distance-right:9pt;mso-wrap-distance-bottom:0;mso-position-horizontal:absolute;mso-position-horizontal-relative:page;mso-position-vertical:absolute;mso-position-vertical-relative:page;mso-width-percent:0;mso-height-percent:0;mso-width-relative:page;mso-height-relative:margin;v-text-anchor:top" o:gfxdata="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" filled="f" stroked="f" strokeweight=".5pt">
                     <v:textbox inset="0,0,0,0">
                       <w:txbxContent>
                         <w:p>
@@ -4305,7 +4301,6 @@
                               <w:dataBinding w:prefixMappings="xmlns:ns0='http://purl.org/dc/elements/1.1/' xmlns:ns1='http://schemas.openxmlformats.org/package/2006/metadata/core-properties' " w:xpath="/ns1:coreProperties[1]/ns0:title[1]" w:storeItemID="{6C3C8BC8-F283-45AE-878A-BAB7291924A1}"/>
                               <w:text/>
                             </w:sdtPr>
-                            <w:sdtEndPr/>
                             <w:sdtContent>
                               <w:r>
                                 <w:rPr>
@@ -6094,7 +6089,7 @@
         </w:rPr>
         <w:lastRenderedPageBreak/>
         <w:drawing>
-          <wp:anchor distT="0" distB="0" distL="114300" distR="114300" simplePos="0" relativeHeight="251658240" behindDoc="1" locked="0" layoutInCell="1" allowOverlap="1" wp14:anchorId="2E43810C" wp14:editId="6EBA6D64">
+          <wp:anchor distT="0" distB="0" distL="114300" distR="114300" simplePos="0" relativeHeight="251658240" behindDoc="1" locked="0" layoutInCell="1" allowOverlap="1" wp14:anchorId="77540D1A" wp14:editId="6E8788D7">
             <wp:simplePos x="0" y="0"/>
             <wp:positionH relativeFrom="column">
               <wp:posOffset>0</wp:posOffset>
@@ -6655,7 +6650,7 @@
           <w:lang w:val="en-US"/>
         </w:rPr>
         <w:drawing>
-          <wp:anchor distT="0" distB="0" distL="114300" distR="114300" simplePos="0" relativeHeight="251659264" behindDoc="1" locked="0" layoutInCell="1" allowOverlap="1" wp14:anchorId="010392D6" wp14:editId="0124D8D0">
+          <wp:anchor distT="0" distB="0" distL="114300" distR="114300" simplePos="0" relativeHeight="251659264" behindDoc="1" locked="0" layoutInCell="1" allowOverlap="1" wp14:anchorId="60999D9C" wp14:editId="00404D1B">
             <wp:simplePos x="0" y="0"/>
             <wp:positionH relativeFrom="column">
               <wp:posOffset>0</wp:posOffset>
@@ -6967,7 +6962,7 @@
           <w:lang w:val="en-US"/>
         </w:rPr>
         <w:drawing>
-          <wp:anchor distT="0" distB="0" distL="114300" distR="114300" simplePos="0" relativeHeight="251660288" behindDoc="1" locked="0" layoutInCell="1" allowOverlap="1" wp14:anchorId="7D9E5876" wp14:editId="3EB49559">
+          <wp:anchor distT="0" distB="0" distL="114300" distR="114300" simplePos="0" relativeHeight="251660288" behindDoc="1" locked="0" layoutInCell="1" allowOverlap="1" wp14:anchorId="3DDAB9B5" wp14:editId="0B1337BD">
             <wp:simplePos x="0" y="0"/>
             <wp:positionH relativeFrom="column">
               <wp:posOffset>1089330</wp:posOffset>
@@ -8240,7 +8235,7 @@
           <w:lang w:val="en-US"/>
         </w:rPr>
         <w:drawing>
-          <wp:anchor distT="0" distB="0" distL="114300" distR="114300" simplePos="0" relativeHeight="251649024" behindDoc="1" locked="0" layoutInCell="1" allowOverlap="1">
+          <wp:anchor distT="0" distB="0" distL="114300" distR="114300" simplePos="0" relativeHeight="251649024" behindDoc="1" locked="0" layoutInCell="1" allowOverlap="1" wp14:anchorId="7B4E0D7F" wp14:editId="7C68B80B">
             <wp:simplePos x="0" y="0"/>
             <wp:positionH relativeFrom="margin">
               <wp:align>right</wp:align>
@@ -8398,7 +8393,7 @@
         </w:rPr>
         <w:lastRenderedPageBreak/>
         <w:drawing>
-          <wp:anchor distT="0" distB="0" distL="114300" distR="114300" simplePos="0" relativeHeight="251650048" behindDoc="1" locked="0" layoutInCell="1" allowOverlap="1">
+          <wp:anchor distT="0" distB="0" distL="114300" distR="114300" simplePos="0" relativeHeight="251650048" behindDoc="1" locked="0" layoutInCell="1" allowOverlap="1" wp14:anchorId="58698863" wp14:editId="63A22AAF">
             <wp:simplePos x="0" y="0"/>
             <wp:positionH relativeFrom="margin">
               <wp:posOffset>558165</wp:posOffset>
@@ -8640,7 +8635,7 @@
           <w:lang w:val="en-US"/>
         </w:rPr>
         <w:drawing>
-          <wp:anchor distT="0" distB="0" distL="114300" distR="114300" simplePos="0" relativeHeight="251652096" behindDoc="1" locked="0" layoutInCell="1" allowOverlap="1">
+          <wp:anchor distT="0" distB="0" distL="114300" distR="114300" simplePos="0" relativeHeight="251652096" behindDoc="1" locked="0" layoutInCell="1" allowOverlap="1" wp14:anchorId="5F4C6AEB" wp14:editId="11AE9011">
             <wp:simplePos x="0" y="0"/>
             <wp:positionH relativeFrom="margin">
               <wp:posOffset>549910</wp:posOffset>
@@ -8708,7 +8703,7 @@
           <w:lang w:val="en-US"/>
         </w:rPr>
         <w:drawing>
-          <wp:anchor distT="0" distB="0" distL="114300" distR="114300" simplePos="0" relativeHeight="251654144" behindDoc="1" locked="0" layoutInCell="1" allowOverlap="1">
+          <wp:anchor distT="0" distB="0" distL="114300" distR="114300" simplePos="0" relativeHeight="251654144" behindDoc="1" locked="0" layoutInCell="1" allowOverlap="1" wp14:anchorId="70D995B8" wp14:editId="6651A0DD">
             <wp:simplePos x="0" y="0"/>
             <wp:positionH relativeFrom="column">
               <wp:posOffset>2966720</wp:posOffset>
@@ -8931,7 +8926,7 @@
           <w:lang w:val="en-US"/>
         </w:rPr>
         <w:drawing>
-          <wp:anchor distT="0" distB="0" distL="114300" distR="114300" simplePos="0" relativeHeight="251656192" behindDoc="1" locked="0" layoutInCell="1" allowOverlap="1">
+          <wp:anchor distT="0" distB="0" distL="114300" distR="114300" simplePos="0" relativeHeight="251656192" behindDoc="1" locked="0" layoutInCell="1" allowOverlap="1" wp14:anchorId="64952336" wp14:editId="4874C228">
             <wp:simplePos x="0" y="0"/>
             <wp:positionH relativeFrom="column">
               <wp:posOffset>740410</wp:posOffset>
@@ -9744,7 +9739,7 @@
           <w:lang w:val="en-US"/>
         </w:rPr>
         <w:drawing>
-          <wp:anchor distT="0" distB="0" distL="114300" distR="114300" simplePos="0" relativeHeight="251661312" behindDoc="1" locked="0" layoutInCell="1" allowOverlap="1" wp14:anchorId="30009A75" wp14:editId="22324429">
+          <wp:anchor distT="0" distB="0" distL="114300" distR="114300" simplePos="0" relativeHeight="251661312" behindDoc="1" locked="0" layoutInCell="1" allowOverlap="1" wp14:anchorId="424955D1" wp14:editId="126E123D">
             <wp:simplePos x="0" y="0"/>
             <wp:positionH relativeFrom="column">
               <wp:posOffset>348615</wp:posOffset>
@@ -9820,7 +9815,7 @@
           <w:lang w:val="en-US"/>
         </w:rPr>
         <w:drawing>
-          <wp:anchor distT="0" distB="0" distL="114300" distR="114300" simplePos="0" relativeHeight="251662336" behindDoc="1" locked="0" layoutInCell="1" allowOverlap="1" wp14:anchorId="7D6DA192" wp14:editId="71DC6595">
+          <wp:anchor distT="0" distB="0" distL="114300" distR="114300" simplePos="0" relativeHeight="251662336" behindDoc="1" locked="0" layoutInCell="1" allowOverlap="1" wp14:anchorId="23BE6370" wp14:editId="59F978C8">
             <wp:simplePos x="0" y="0"/>
             <wp:positionH relativeFrom="column">
               <wp:posOffset>3625215</wp:posOffset>
@@ -10123,7 +10118,7 @@
           <w:lang w:val="en-US"/>
         </w:rPr>
         <w:drawing>
-          <wp:anchor distT="0" distB="0" distL="114300" distR="114300" simplePos="0" relativeHeight="251663360" behindDoc="1" locked="0" layoutInCell="1" allowOverlap="1" wp14:anchorId="2F31F599" wp14:editId="2AA7BAC9">
+          <wp:anchor distT="0" distB="0" distL="114300" distR="114300" simplePos="0" relativeHeight="251663360" behindDoc="1" locked="0" layoutInCell="1" allowOverlap="1" wp14:anchorId="529B7A3B" wp14:editId="31AD00A7">
             <wp:simplePos x="0" y="0"/>
             <wp:positionH relativeFrom="column">
               <wp:posOffset>1358265</wp:posOffset>
@@ -10189,7 +10184,7 @@
           <w:lang w:val="en-US"/>
         </w:rPr>
         <w:drawing>
-          <wp:anchor distT="0" distB="0" distL="114300" distR="114300" simplePos="0" relativeHeight="251664384" behindDoc="1" locked="0" layoutInCell="1" allowOverlap="1" wp14:anchorId="7FB58071" wp14:editId="710D5D91">
+          <wp:anchor distT="0" distB="0" distL="114300" distR="114300" simplePos="0" relativeHeight="251664384" behindDoc="1" locked="0" layoutInCell="1" allowOverlap="1" wp14:anchorId="54FECAA1" wp14:editId="4DB052A9">
             <wp:simplePos x="0" y="0"/>
             <wp:positionH relativeFrom="column">
               <wp:posOffset>2758440</wp:posOffset>
@@ -10411,7 +10406,7 @@
           <w:lang w:val="en-US"/>
         </w:rPr>
         <w:drawing>
-          <wp:anchor distT="0" distB="0" distL="114300" distR="114300" simplePos="0" relativeHeight="251665408" behindDoc="1" locked="0" layoutInCell="1" allowOverlap="1" wp14:anchorId="28CB80E2" wp14:editId="221C25A9">
+          <wp:anchor distT="0" distB="0" distL="114300" distR="114300" simplePos="0" relativeHeight="251665408" behindDoc="1" locked="0" layoutInCell="1" allowOverlap="1" wp14:anchorId="006004E0" wp14:editId="03F39B64">
             <wp:simplePos x="0" y="0"/>
             <wp:positionH relativeFrom="margin">
               <wp:align>center</wp:align>
@@ -10656,7 +10651,7 @@
           <w:lang w:val="en-US"/>
         </w:rPr>
         <w:drawing>
-          <wp:anchor distT="0" distB="0" distL="114300" distR="114300" simplePos="0" relativeHeight="251666432" behindDoc="1" locked="0" layoutInCell="1" allowOverlap="1" wp14:anchorId="2CDD89C8" wp14:editId="49FB78C6">
+          <wp:anchor distT="0" distB="0" distL="114300" distR="114300" simplePos="0" relativeHeight="251666432" behindDoc="1" locked="0" layoutInCell="1" allowOverlap="1" wp14:anchorId="02883F17" wp14:editId="3FE90323">
             <wp:simplePos x="0" y="0"/>
             <wp:positionH relativeFrom="margin">
               <wp:posOffset>1729740</wp:posOffset>
@@ -16192,7 +16187,7 @@
     </w:p>
     <w:tbl>
       <w:tblPr>
-        <w:tblStyle w:val="Cuadrculadetablaclara"/>
+        <w:tblStyle w:val="Tablaconcuadrculaclara"/>
         <w:tblW w:w="10916" w:type="dxa"/>
         <w:tblInd w:w="-1168" w:type="dxa"/>
         <w:tblLook w:val="04A0" w:firstRow="1" w:lastRow="0" w:firstColumn="1" w:lastColumn="0" w:noHBand="0" w:noVBand="1"/>
@@ -22790,10 +22785,7 @@
         <w:t>El punto de equilibrio respecto de la cantidad de puntos a instalar durante el primer año es de 6 puntos, y respecto al precio, es de 49.928,73.</w:t>
       </w:r>
     </w:p>
-    <w:p>
-      <w:bookmarkStart w:id="0" w:name="_GoBack"/>
-      <w:bookmarkEnd w:id="0"/>
-    </w:p>
+    <w:p/>
     <w:p/>
     <w:sectPr>
       <w:headerReference w:type="default" r:id="rId22"/>
@@ -22810,7 +22802,7 @@
 </file>
 
 <file path=word/endnotes.xml><?xml version="1.0" encoding="utf-8"?>
-<w:endnotes xmlns:wpc="http://schemas.microsoft.com/office/word/2010/wordprocessingCanvas" xmlns:cx="http://schemas.microsoft.com/office/drawing/2014/chartex" xmlns:cx1="http://schemas.microsoft.com/office/drawing/2015/9/8/chartex" xmlns:mc="http://schemas.openxmlformats.org/markup-compatibility/2006" xmlns:o="urn:schemas-microsoft-com:office:office" xmlns:r="http://schemas.openxmlformats.org/officeDocument/2006/relationships" xmlns:m="http://schemas.openxmlformats.org/officeDocument/2006/math" xmlns:v="urn:schemas-microsoft-com:vml" xmlns:wp14="http://schemas.microsoft.com/office/word/2010/wordprocessingDrawing" xmlns:wp="http://schemas.openxmlformats.org/drawingml/2006/wordprocessingDrawing" xmlns:w10="urn:schemas-microsoft-com:office:word" xmlns:w="http://schemas.openxmlformats.org/wordprocessingml/2006/main" xmlns:w14="http://schemas.microsoft.com/office/word/2010/wordml" xmlns:w15="http://schemas.microsoft.com/office/word/2012/wordml" xmlns:w16se="http://schemas.microsoft.com/office/word/2015/wordml/symex" xmlns:wpg="http://schemas.microsoft.com/office/word/2010/wordprocessingGroup" xmlns:wpi="http://schemas.microsoft.com/office/word/2010/wordprocessingInk" xmlns:wne="http://schemas.microsoft.com/office/word/2006/wordml" xmlns:wps="http://schemas.microsoft.com/office/word/2010/wordprocessingShape" mc:Ignorable="w14 w15 w16se wp14">
+<w:endnotes xmlns:wpc="http://schemas.microsoft.com/office/word/2010/wordprocessingCanvas" xmlns:cx="http://schemas.microsoft.com/office/drawing/2014/chartex" xmlns:cx1="http://schemas.microsoft.com/office/drawing/2015/9/8/chartex" xmlns:cx2="http://schemas.microsoft.com/office/drawing/2015/10/21/chartex" xmlns:cx3="http://schemas.microsoft.com/office/drawing/2016/5/9/chartex" xmlns:cx4="http://schemas.microsoft.com/office/drawing/2016/5/10/chartex" xmlns:cx5="http://schemas.microsoft.com/office/drawing/2016/5/11/chartex" xmlns:cx6="http://schemas.microsoft.com/office/drawing/2016/5/12/chartex" xmlns:cx7="http://schemas.microsoft.com/office/drawing/2016/5/13/chartex" xmlns:cx8="http://schemas.microsoft.com/office/drawing/2016/5/14/chartex" xmlns:mc="http://schemas.openxmlformats.org/markup-compatibility/2006" xmlns:aink="http://schemas.microsoft.com/office/drawing/2016/ink" xmlns:am3d="http://schemas.microsoft.com/office/drawing/2017/model3d" xmlns:o="urn:schemas-microsoft-com:office:office" xmlns:oel="http://schemas.microsoft.com/office/2019/extlst" xmlns:r="http://schemas.openxmlformats.org/officeDocument/2006/relationships" xmlns:m="http://schemas.openxmlformats.org/officeDocument/2006/math" xmlns:v="urn:schemas-microsoft-com:vml" xmlns:wp14="http://schemas.microsoft.com/office/word/2010/wordprocessingDrawing" xmlns:wp="http://schemas.openxmlformats.org/drawingml/2006/wordprocessingDrawing" xmlns:w10="urn:schemas-microsoft-com:office:word" xmlns:w="http://schemas.openxmlformats.org/wordprocessingml/2006/main" xmlns:w14="http://schemas.microsoft.com/office/word/2010/wordml" xmlns:w15="http://schemas.microsoft.com/office/word/2012/wordml" xmlns:w16cex="http://schemas.microsoft.com/office/word/2018/wordml/cex" xmlns:w16cid="http://schemas.microsoft.com/office/word/2016/wordml/cid" xmlns:w16="http://schemas.microsoft.com/office/word/2018/wordml" xmlns:w16du="http://schemas.microsoft.com/office/word/2023/wordml/word16du" xmlns:w16sdtdh="http://schemas.microsoft.com/office/word/2020/wordml/sdtdatahash" xmlns:w16sdtfl="http://schemas.microsoft.com/office/word/2024/wordml/sdtformatlock" xmlns:w16se="http://schemas.microsoft.com/office/word/2015/wordml/symex" xmlns:wpg="http://schemas.microsoft.com/office/word/2010/wordprocessingGroup" xmlns:wpi="http://schemas.microsoft.com/office/word/2010/wordprocessingInk" xmlns:wne="http://schemas.microsoft.com/office/word/2006/wordml" xmlns:wps="http://schemas.microsoft.com/office/word/2010/wordprocessingShape" mc:Ignorable="w14 w15 w16se w16cid w16 w16cex w16sdtdh w16sdtfl w16du wp14">
   <w:endnote w:type="separator" w:id="-1">
     <w:p>
       <w:pPr>
@@ -22835,7 +22827,7 @@
 </file>
 
 <file path=word/footer1.xml><?xml version="1.0" encoding="utf-8"?>
-<w:ftr xmlns:wpc="http://schemas.microsoft.com/office/word/2010/wordprocessingCanvas" xmlns:cx="http://schemas.microsoft.com/office/drawing/2014/chartex" xmlns:cx1="http://schemas.microsoft.com/office/drawing/2015/9/8/chartex" xmlns:mc="http://schemas.openxmlformats.org/markup-compatibility/2006" xmlns:o="urn:schemas-microsoft-com:office:office" xmlns:r="http://schemas.openxmlformats.org/officeDocument/2006/relationships" xmlns:m="http://schemas.openxmlformats.org/officeDocument/2006/math" xmlns:v="urn:schemas-microsoft-com:vml" xmlns:wp14="http://schemas.microsoft.com/office/word/2010/wordprocessingDrawing" xmlns:wp="http://schemas.openxmlformats.org/drawingml/2006/wordprocessingDrawing" xmlns:w10="urn:schemas-microsoft-com:office:word" xmlns:w="http://schemas.openxmlformats.org/wordprocessingml/2006/main" xmlns:w14="http://schemas.microsoft.com/office/word/2010/wordml" xmlns:w15="http://schemas.microsoft.com/office/word/2012/wordml" xmlns:w16se="http://schemas.microsoft.com/office/word/2015/wordml/symex" xmlns:wpg="http://schemas.microsoft.com/office/word/2010/wordprocessingGroup" xmlns:wpi="http://schemas.microsoft.com/office/word/2010/wordprocessingInk" xmlns:wne="http://schemas.microsoft.com/office/word/2006/wordml" xmlns:wps="http://schemas.microsoft.com/office/word/2010/wordprocessingShape" mc:Ignorable="w14 w15 w16se wp14">
+<w:ftr xmlns:wpc="http://schemas.microsoft.com/office/word/2010/wordprocessingCanvas" xmlns:cx="http://schemas.microsoft.com/office/drawing/2014/chartex" xmlns:cx1="http://schemas.microsoft.com/office/drawing/2015/9/8/chartex" xmlns:cx2="http://schemas.microsoft.com/office/drawing/2015/10/21/chartex" xmlns:cx3="http://schemas.microsoft.com/office/drawing/2016/5/9/chartex" xmlns:cx4="http://schemas.microsoft.com/office/drawing/2016/5/10/chartex" xmlns:cx5="http://schemas.microsoft.com/office/drawing/2016/5/11/chartex" xmlns:cx6="http://schemas.microsoft.com/office/drawing/2016/5/12/chartex" xmlns:cx7="http://schemas.microsoft.com/office/drawing/2016/5/13/chartex" xmlns:cx8="http://schemas.microsoft.com/office/drawing/2016/5/14/chartex" xmlns:mc="http://schemas.openxmlformats.org/markup-compatibility/2006" xmlns:aink="http://schemas.microsoft.com/office/drawing/2016/ink" xmlns:am3d="http://schemas.microsoft.com/office/drawing/2017/model3d" xmlns:o="urn:schemas-microsoft-com:office:office" xmlns:oel="http://schemas.microsoft.com/office/2019/extlst" xmlns:r="http://schemas.openxmlformats.org/officeDocument/2006/relationships" xmlns:m="http://schemas.openxmlformats.org/officeDocument/2006/math" xmlns:v="urn:schemas-microsoft-com:vml" xmlns:wp14="http://schemas.microsoft.com/office/word/2010/wordprocessingDrawing" xmlns:wp="http://schemas.openxmlformats.org/drawingml/2006/wordprocessingDrawing" xmlns:w10="urn:schemas-microsoft-com:office:word" xmlns:w="http://schemas.openxmlformats.org/wordprocessingml/2006/main" xmlns:w14="http://schemas.microsoft.com/office/word/2010/wordml" xmlns:w15="http://schemas.microsoft.com/office/word/2012/wordml" xmlns:w16cex="http://schemas.microsoft.com/office/word/2018/wordml/cex" xmlns:w16cid="http://schemas.microsoft.com/office/word/2016/wordml/cid" xmlns:w16="http://schemas.microsoft.com/office/word/2018/wordml" xmlns:w16du="http://schemas.microsoft.com/office/word/2023/wordml/word16du" xmlns:w16sdtdh="http://schemas.microsoft.com/office/word/2020/wordml/sdtdatahash" xmlns:w16sdtfl="http://schemas.microsoft.com/office/word/2024/wordml/sdtformatlock" xmlns:w16se="http://schemas.microsoft.com/office/word/2015/wordml/symex" xmlns:wpg="http://schemas.microsoft.com/office/word/2010/wordprocessingGroup" xmlns:wpi="http://schemas.microsoft.com/office/word/2010/wordprocessingInk" xmlns:wne="http://schemas.microsoft.com/office/word/2006/wordml" xmlns:wps="http://schemas.microsoft.com/office/word/2010/wordprocessingShape" mc:Ignorable="w14 w15 w16se w16cid w16 w16cex w16sdtdh w16sdtfl w16du wp14">
   <w:sdt>
     <w:sdtPr>
       <w:id w:val="-391962739"/>
@@ -22844,7 +22836,6 @@
         <w:docPartUnique/>
       </w:docPartObj>
     </w:sdtPr>
-    <w:sdtEndPr/>
     <w:sdtContent>
       <w:p>
         <w:pPr>
@@ -22861,7 +22852,7 @@
           <mc:AlternateContent>
             <mc:Choice Requires="wps">
               <w:drawing>
-                <wp:anchor distT="0" distB="0" distL="114300" distR="114300" simplePos="0" relativeHeight="251659264" behindDoc="0" locked="0" layoutInCell="1" allowOverlap="1">
+                <wp:anchor distT="0" distB="0" distL="114300" distR="114300" simplePos="0" relativeHeight="251659264" behindDoc="0" locked="0" layoutInCell="1" allowOverlap="1" wp14:anchorId="6338F165" wp14:editId="1A919BAA">
                   <wp:simplePos x="0" y="0"/>
                   <wp:positionH relativeFrom="rightMargin">
                     <wp:align>center</wp:align>
@@ -22974,7 +22965,7 @@
             </mc:Choice>
             <mc:Fallback>
               <w:pict>
-                <v:shapetype id="_x0000_t176" coordsize="21600,21600" o:spt="176" adj="2700" path="m@0,qx0@0l0@2qy@0,21600l@1,21600qx21600@2l21600@0qy@1,xe">
+                <v:shapetype w14:anchorId="6338F165" id="_x0000_t176" coordsize="21600,21600" o:spt="176" adj="2700" path="m@0,qx0@0l0@2qy@0,21600l@1,21600qx21600@2l21600@0qy@1,xe">
                   <v:stroke joinstyle="miter"/>
                   <v:formulas>
                     <v:f eqn="val #0"/>
@@ -22990,7 +22981,7 @@
                   </v:formulas>
                   <v:path gradientshapeok="t" limo="10800,10800" o:connecttype="custom" o:connectlocs="@8,0;0,@9;@8,@7;@6,@9" textboxrect="@3,@3,@4,@5"/>
                 </v:shapetype>
-                <v:shape id="Diagrama de flujo: proceso alternativo 46" o:spid="_x0000_s1058" type="#_x0000_t176" style="position:absolute;margin-left:0;margin-top:0;width:40.35pt;height:34.75pt;z-index:251659264;visibility:visible;mso-wrap-style:square;mso-width-percent:0;mso-height-percent:0;mso-wrap-distance-left:9pt;mso-wrap-distance-top:0;mso-wrap-distance-right:9pt;mso-wrap-distance-bottom:0;mso-position-horizontal:center;mso-position-horizontal-relative:right-margin-area;mso-position-vertical:center;mso-position-vertical-relative:bottom-margin-area;mso-width-percent:0;mso-height-percent:0;mso-width-relative:page;mso-height-relative:page;v-text-anchor:top" o:gfxdata="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" filled="f" fillcolor="#5c83b4" stroked="f" strokecolor="#737373">
+                <v:shape id="Diagrama de flujo: proceso alternativo 46" o:spid="_x0000_s1058" type="#_x0000_t176" style="position:absolute;margin-left:0;margin-top:0;width:40.35pt;height:34.75pt;z-index:251659264;visibility:visible;mso-wrap-style:square;mso-width-percent:0;mso-height-percent:0;mso-wrap-distance-left:9pt;mso-wrap-distance-top:0;mso-wrap-distance-right:9pt;mso-wrap-distance-bottom:0;mso-position-horizontal:center;mso-position-horizontal-relative:right-margin-area;mso-position-vertical:center;mso-position-vertical-relative:bottom-margin-area;mso-width-percent:0;mso-height-percent:0;mso-width-relative:page;mso-height-relative:page;v-text-anchor:top" o:gfxdata="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" filled="f" fillcolor="#5c83b4" stroked="f" strokecolor="#737373">
                   <v:textbox>
                     <w:txbxContent>
                       <w:p>
@@ -23047,7 +23038,7 @@
 </file>
 
 <file path=word/footnotes.xml><?xml version="1.0" encoding="utf-8"?>
-<w:footnotes xmlns:wpc="http://schemas.microsoft.com/office/word/2010/wordprocessingCanvas" xmlns:cx="http://schemas.microsoft.com/office/drawing/2014/chartex" xmlns:cx1="http://schemas.microsoft.com/office/drawing/2015/9/8/chartex" xmlns:mc="http://schemas.openxmlformats.org/markup-compatibility/2006" xmlns:o="urn:schemas-microsoft-com:office:office" xmlns:r="http://schemas.openxmlformats.org/officeDocument/2006/relationships" xmlns:m="http://schemas.openxmlformats.org/officeDocument/2006/math" xmlns:v="urn:schemas-microsoft-com:vml" xmlns:wp14="http://schemas.microsoft.com/office/word/2010/wordprocessingDrawing" xmlns:wp="http://schemas.openxmlformats.org/drawingml/2006/wordprocessingDrawing" xmlns:w10="urn:schemas-microsoft-com:office:word" xmlns:w="http://schemas.openxmlformats.org/wordprocessingml/2006/main" xmlns:w14="http://schemas.microsoft.com/office/word/2010/wordml" xmlns:w15="http://schemas.microsoft.com/office/word/2012/wordml" xmlns:w16se="http://schemas.microsoft.com/office/word/2015/wordml/symex" xmlns:wpg="http://schemas.microsoft.com/office/word/2010/wordprocessingGroup" xmlns:wpi="http://schemas.microsoft.com/office/word/2010/wordprocessingInk" xmlns:wne="http://schemas.microsoft.com/office/word/2006/wordml" xmlns:wps="http://schemas.microsoft.com/office/word/2010/wordprocessingShape" mc:Ignorable="w14 w15 w16se wp14">
+<w:footnotes xmlns:wpc="http://schemas.microsoft.com/office/word/2010/wordprocessingCanvas" xmlns:cx="http://schemas.microsoft.com/office/drawing/2014/chartex" xmlns:cx1="http://schemas.microsoft.com/office/drawing/2015/9/8/chartex" xmlns:cx2="http://schemas.microsoft.com/office/drawing/2015/10/21/chartex" xmlns:cx3="http://schemas.microsoft.com/office/drawing/2016/5/9/chartex" xmlns:cx4="http://schemas.microsoft.com/office/drawing/2016/5/10/chartex" xmlns:cx5="http://schemas.microsoft.com/office/drawing/2016/5/11/chartex" xmlns:cx6="http://schemas.microsoft.com/office/drawing/2016/5/12/chartex" xmlns:cx7="http://schemas.microsoft.com/office/drawing/2016/5/13/chartex" xmlns:cx8="http://schemas.microsoft.com/office/drawing/2016/5/14/chartex" xmlns:mc="http://schemas.openxmlformats.org/markup-compatibility/2006" xmlns:aink="http://schemas.microsoft.com/office/drawing/2016/ink" xmlns:am3d="http://schemas.microsoft.com/office/drawing/2017/model3d" xmlns:o="urn:schemas-microsoft-com:office:office" xmlns:oel="http://schemas.microsoft.com/office/2019/extlst" xmlns:r="http://schemas.openxmlformats.org/officeDocument/2006/relationships" xmlns:m="http://schemas.openxmlformats.org/officeDocument/2006/math" xmlns:v="urn:schemas-microsoft-com:vml" xmlns:wp14="http://schemas.microsoft.com/office/word/2010/wordprocessingDrawing" xmlns:wp="http://schemas.openxmlformats.org/drawingml/2006/wordprocessingDrawing" xmlns:w10="urn:schemas-microsoft-com:office:word" xmlns:w="http://schemas.openxmlformats.org/wordprocessingml/2006/main" xmlns:w14="http://schemas.microsoft.com/office/word/2010/wordml" xmlns:w15="http://schemas.microsoft.com/office/word/2012/wordml" xmlns:w16cex="http://schemas.microsoft.com/office/word/2018/wordml/cex" xmlns:w16cid="http://schemas.microsoft.com/office/word/2016/wordml/cid" xmlns:w16="http://schemas.microsoft.com/office/word/2018/wordml" xmlns:w16du="http://schemas.microsoft.com/office/word/2023/wordml/word16du" xmlns:w16sdtdh="http://schemas.microsoft.com/office/word/2020/wordml/sdtdatahash" xmlns:w16sdtfl="http://schemas.microsoft.com/office/word/2024/wordml/sdtformatlock" xmlns:w16se="http://schemas.microsoft.com/office/word/2015/wordml/symex" xmlns:wpg="http://schemas.microsoft.com/office/word/2010/wordprocessingGroup" xmlns:wpi="http://schemas.microsoft.com/office/word/2010/wordprocessingInk" xmlns:wne="http://schemas.microsoft.com/office/word/2006/wordml" xmlns:wps="http://schemas.microsoft.com/office/word/2010/wordprocessingShape" mc:Ignorable="w14 w15 w16se w16cid w16 w16cex w16sdtdh w16sdtfl w16du wp14">
   <w:footnote w:type="separator" w:id="-1">
     <w:p>
       <w:pPr>
@@ -23072,7 +23063,7 @@
 </file>
 
 <file path=word/header1.xml><?xml version="1.0" encoding="utf-8"?>
-<w:hdr xmlns:wpc="http://schemas.microsoft.com/office/word/2010/wordprocessingCanvas" xmlns:cx="http://schemas.microsoft.com/office/drawing/2014/chartex" xmlns:cx1="http://schemas.microsoft.com/office/drawing/2015/9/8/chartex" xmlns:mc="http://schemas.openxmlformats.org/markup-compatibility/2006" xmlns:o="urn:schemas-microsoft-com:office:office" xmlns:r="http://schemas.openxmlformats.org/officeDocument/2006/relationships" xmlns:m="http://schemas.openxmlformats.org/officeDocument/2006/math" xmlns:v="urn:schemas-microsoft-com:vml" xmlns:wp14="http://schemas.microsoft.com/office/word/2010/wordprocessingDrawing" xmlns:wp="http://schemas.openxmlformats.org/drawingml/2006/wordprocessingDrawing" xmlns:w10="urn:schemas-microsoft-com:office:word" xmlns:w="http://schemas.openxmlformats.org/wordprocessingml/2006/main" xmlns:w14="http://schemas.microsoft.com/office/word/2010/wordml" xmlns:w15="http://schemas.microsoft.com/office/word/2012/wordml" xmlns:w16se="http://schemas.microsoft.com/office/word/2015/wordml/symex" xmlns:wpg="http://schemas.microsoft.com/office/word/2010/wordprocessingGroup" xmlns:wpi="http://schemas.microsoft.com/office/word/2010/wordprocessingInk" xmlns:wne="http://schemas.microsoft.com/office/word/2006/wordml" xmlns:wps="http://schemas.microsoft.com/office/word/2010/wordprocessingShape" mc:Ignorable="w14 w15 w16se wp14">
+<w:hdr xmlns:wpc="http://schemas.microsoft.com/office/word/2010/wordprocessingCanvas" xmlns:cx="http://schemas.microsoft.com/office/drawing/2014/chartex" xmlns:cx1="http://schemas.microsoft.com/office/drawing/2015/9/8/chartex" xmlns:cx2="http://schemas.microsoft.com/office/drawing/2015/10/21/chartex" xmlns:cx3="http://schemas.microsoft.com/office/drawing/2016/5/9/chartex" xmlns:cx4="http://schemas.microsoft.com/office/drawing/2016/5/10/chartex" xmlns:cx5="http://schemas.microsoft.com/office/drawing/2016/5/11/chartex" xmlns:cx6="http://schemas.microsoft.com/office/drawing/2016/5/12/chartex" xmlns:cx7="http://schemas.microsoft.com/office/drawing/2016/5/13/chartex" xmlns:cx8="http://schemas.microsoft.com/office/drawing/2016/5/14/chartex" xmlns:mc="http://schemas.openxmlformats.org/markup-compatibility/2006" xmlns:aink="http://schemas.microsoft.com/office/drawing/2016/ink" xmlns:am3d="http://schemas.microsoft.com/office/drawing/2017/model3d" xmlns:o="urn:schemas-microsoft-com:office:office" xmlns:oel="http://schemas.microsoft.com/office/2019/extlst" xmlns:r="http://schemas.openxmlformats.org/officeDocument/2006/relationships" xmlns:m="http://schemas.openxmlformats.org/officeDocument/2006/math" xmlns:v="urn:schemas-microsoft-com:vml" xmlns:wp14="http://schemas.microsoft.com/office/word/2010/wordprocessingDrawing" xmlns:wp="http://schemas.openxmlformats.org/drawingml/2006/wordprocessingDrawing" xmlns:w10="urn:schemas-microsoft-com:office:word" xmlns:w="http://schemas.openxmlformats.org/wordprocessingml/2006/main" xmlns:w14="http://schemas.microsoft.com/office/word/2010/wordml" xmlns:w15="http://schemas.microsoft.com/office/word/2012/wordml" xmlns:w16cex="http://schemas.microsoft.com/office/word/2018/wordml/cex" xmlns:w16cid="http://schemas.microsoft.com/office/word/2016/wordml/cid" xmlns:w16="http://schemas.microsoft.com/office/word/2018/wordml" xmlns:w16du="http://schemas.microsoft.com/office/word/2023/wordml/word16du" xmlns:w16sdtdh="http://schemas.microsoft.com/office/word/2020/wordml/sdtdatahash" xmlns:w16sdtfl="http://schemas.microsoft.com/office/word/2024/wordml/sdtformatlock" xmlns:w16se="http://schemas.microsoft.com/office/word/2015/wordml/symex" xmlns:wpg="http://schemas.microsoft.com/office/word/2010/wordprocessingGroup" xmlns:wpi="http://schemas.microsoft.com/office/word/2010/wordprocessingInk" xmlns:wne="http://schemas.microsoft.com/office/word/2006/wordml" xmlns:wps="http://schemas.microsoft.com/office/word/2010/wordprocessingShape" mc:Ignorable="w14 w15 w16se w16cid w16 w16cex w16sdtdh w16sdtfl w16du wp14">
   <w:tbl>
     <w:tblPr>
       <w:tblStyle w:val="Tablaconcuadrcula"/>
@@ -23107,7 +23098,7 @@
               <w:lang w:val="en-US"/>
             </w:rPr>
             <w:drawing>
-              <wp:inline distT="0" distB="0" distL="0" distR="0" wp14:anchorId="6E958C49" wp14:editId="0DB66468">
+              <wp:inline distT="0" distB="0" distL="0" distR="0" wp14:anchorId="4C027F39" wp14:editId="16D77890">
                 <wp:extent cx="695325" cy="695325"/>
                 <wp:effectExtent l="0" t="0" r="9525" b="9525"/>
                 <wp:docPr id="33" name="Imagen 33"/>
@@ -23313,7 +23304,7 @@
 </file>
 
 <file path=word/numbering.xml><?xml version="1.0" encoding="utf-8"?>
-<w:numbering xmlns:wpc="http://schemas.microsoft.com/office/word/2010/wordprocessingCanvas" xmlns:cx="http://schemas.microsoft.com/office/drawing/2014/chartex" xmlns:cx1="http://schemas.microsoft.com/office/drawing/2015/9/8/chartex" xmlns:mc="http://schemas.openxmlformats.org/markup-compatibility/2006" xmlns:o="urn:schemas-microsoft-com:office:office" xmlns:r="http://schemas.openxmlformats.org/officeDocument/2006/relationships" xmlns:m="http://schemas.openxmlformats.org/officeDocument/2006/math" xmlns:v="urn:schemas-microsoft-com:vml" xmlns:wp14="http://schemas.microsoft.com/office/word/2010/wordprocessingDrawing" xmlns:wp="http://schemas.openxmlformats.org/drawingml/2006/wordprocessingDrawing" xmlns:w10="urn:schemas-microsoft-com:office:word" xmlns:w="http://schemas.openxmlformats.org/wordprocessingml/2006/main" xmlns:w14="http://schemas.microsoft.com/office/word/2010/wordml" xmlns:w15="http://schemas.microsoft.com/office/word/2012/wordml" xmlns:w16se="http://schemas.microsoft.com/office/word/2015/wordml/symex" xmlns:wpg="http://schemas.microsoft.com/office/word/2010/wordprocessingGroup" xmlns:wpi="http://schemas.microsoft.com/office/word/2010/wordprocessingInk" xmlns:wne="http://schemas.microsoft.com/office/word/2006/wordml" xmlns:wps="http://schemas.microsoft.com/office/word/2010/wordprocessingShape" mc:Ignorable="w14 w15 w16se wp14">
+<w:numbering xmlns:wpc="http://schemas.microsoft.com/office/word/2010/wordprocessingCanvas" xmlns:cx="http://schemas.microsoft.com/office/drawing/2014/chartex" xmlns:cx1="http://schemas.microsoft.com/office/drawing/2015/9/8/chartex" xmlns:cx2="http://schemas.microsoft.com/office/drawing/2015/10/21/chartex" xmlns:cx3="http://schemas.microsoft.com/office/drawing/2016/5/9/chartex" xmlns:cx4="http://schemas.microsoft.com/office/drawing/2016/5/10/chartex" xmlns:cx5="http://schemas.microsoft.com/office/drawing/2016/5/11/chartex" xmlns:cx6="http://schemas.microsoft.com/office/drawing/2016/5/12/chartex" xmlns:cx7="http://schemas.microsoft.com/office/drawing/2016/5/13/chartex" xmlns:cx8="http://schemas.microsoft.com/office/drawing/2016/5/14/chartex" xmlns:mc="http://schemas.openxmlformats.org/markup-compatibility/2006" xmlns:aink="http://schemas.microsoft.com/office/drawing/2016/ink" xmlns:am3d="http://schemas.microsoft.com/office/drawing/2017/model3d" xmlns:o="urn:schemas-microsoft-com:office:office" xmlns:oel="http://schemas.microsoft.com/office/2019/extlst" xmlns:r="http://schemas.openxmlformats.org/officeDocument/2006/relationships" xmlns:m="http://schemas.openxmlformats.org/officeDocument/2006/math" xmlns:v="urn:schemas-microsoft-com:vml" xmlns:wp14="http://schemas.microsoft.com/office/word/2010/wordprocessingDrawing" xmlns:wp="http://schemas.openxmlformats.org/drawingml/2006/wordprocessingDrawing" xmlns:w10="urn:schemas-microsoft-com:office:word" xmlns:w="http://schemas.openxmlformats.org/wordprocessingml/2006/main" xmlns:w14="http://schemas.microsoft.com/office/word/2010/wordml" xmlns:w15="http://schemas.microsoft.com/office/word/2012/wordml" xmlns:w16cex="http://schemas.microsoft.com/office/word/2018/wordml/cex" xmlns:w16cid="http://schemas.microsoft.com/office/word/2016/wordml/cid" xmlns:w16="http://schemas.microsoft.com/office/word/2018/wordml" xmlns:w16du="http://schemas.microsoft.com/office/word/2023/wordml/word16du" xmlns:w16sdtdh="http://schemas.microsoft.com/office/word/2020/wordml/sdtdatahash" xmlns:w16sdtfl="http://schemas.microsoft.com/office/word/2024/wordml/sdtformatlock" xmlns:w16se="http://schemas.microsoft.com/office/word/2015/wordml/symex" xmlns:wpg="http://schemas.microsoft.com/office/word/2010/wordprocessingGroup" xmlns:wpi="http://schemas.microsoft.com/office/word/2010/wordprocessingInk" xmlns:wne="http://schemas.microsoft.com/office/word/2006/wordml" xmlns:wps="http://schemas.microsoft.com/office/word/2010/wordprocessingShape" mc:Ignorable="w14 w15 w16se w16cid w16 w16cex w16sdtdh w16sdtfl w16du wp14">
   <w:abstractNum w:abstractNumId="0" w15:restartNumberingAfterBreak="0">
     <w:nsid w:val="185F3751"/>
     <w:multiLevelType w:val="hybridMultilevel"/>
@@ -23740,16 +23731,16 @@
       </w:rPr>
     </w:lvl>
   </w:abstractNum>
-  <w:num w:numId="1">
+  <w:num w:numId="1" w16cid:durableId="1361857478">
     <w:abstractNumId w:val="3"/>
   </w:num>
-  <w:num w:numId="2">
+  <w:num w:numId="2" w16cid:durableId="1312904405">
     <w:abstractNumId w:val="1"/>
   </w:num>
-  <w:num w:numId="3">
+  <w:num w:numId="3" w16cid:durableId="537859226">
     <w:abstractNumId w:val="2"/>
   </w:num>
-  <w:num w:numId="4">
+  <w:num w:numId="4" w16cid:durableId="828525718">
     <w:abstractNumId w:val="0"/>
     <w:lvlOverride w:ilvl="0">
       <w:startOverride w:val="1"/>
@@ -23783,7 +23774,7 @@
 </file>
 
 <file path=word/styles.xml><?xml version="1.0" encoding="utf-8"?>
-<w:styles xmlns:mc="http://schemas.openxmlformats.org/markup-compatibility/2006" xmlns:r="http://schemas.openxmlformats.org/officeDocument/2006/relationships" xmlns:w="http://schemas.openxmlformats.org/wordprocessingml/2006/main" xmlns:w14="http://schemas.microsoft.com/office/word/2010/wordml" xmlns:w15="http://schemas.microsoft.com/office/word/2012/wordml" xmlns:w16se="http://schemas.microsoft.com/office/word/2015/wordml/symex" mc:Ignorable="w14 w15 w16se">
+<w:styles xmlns:mc="http://schemas.openxmlformats.org/markup-compatibility/2006" xmlns:r="http://schemas.openxmlformats.org/officeDocument/2006/relationships" xmlns:w="http://schemas.openxmlformats.org/wordprocessingml/2006/main" xmlns:w14="http://schemas.microsoft.com/office/word/2010/wordml" xmlns:w15="http://schemas.microsoft.com/office/word/2012/wordml" xmlns:w16cex="http://schemas.microsoft.com/office/word/2018/wordml/cex" xmlns:w16cid="http://schemas.microsoft.com/office/word/2016/wordml/cid" xmlns:w16="http://schemas.microsoft.com/office/word/2018/wordml" xmlns:w16du="http://schemas.microsoft.com/office/word/2023/wordml/word16du" xmlns:w16sdtdh="http://schemas.microsoft.com/office/word/2020/wordml/sdtdatahash" xmlns:w16sdtfl="http://schemas.microsoft.com/office/word/2024/wordml/sdtformatlock" xmlns:w16se="http://schemas.microsoft.com/office/word/2015/wordml/symex" mc:Ignorable="w14 w15 w16se w16cid w16 w16cex w16sdtdh w16sdtfl w16du">
   <w:docDefaults>
     <w:rPrDefault>
       <w:rPr>
@@ -23799,7 +23790,7 @@
       </w:pPr>
     </w:pPrDefault>
   </w:docDefaults>
-  <w:latentStyles w:defLockedState="0" w:defUIPriority="99" w:defSemiHidden="0" w:defUnhideWhenUsed="0" w:defQFormat="0" w:count="371">
+  <w:latentStyles w:defLockedState="0" w:defUIPriority="99" w:defSemiHidden="0" w:defUnhideWhenUsed="0" w:defQFormat="0" w:count="376">
     <w:lsdException w:name="Normal" w:uiPriority="0" w:qFormat="1"/>
     <w:lsdException w:name="heading 1" w:uiPriority="9" w:qFormat="1"/>
     <w:lsdException w:name="heading 2" w:semiHidden="1" w:uiPriority="9" w:unhideWhenUsed="1" w:qFormat="1"/>
@@ -24171,6 +24162,11 @@
     <w:lsdException w:name="List Table 5 Dark Accent 6" w:uiPriority="50"/>
     <w:lsdException w:name="List Table 6 Colorful Accent 6" w:uiPriority="51"/>
     <w:lsdException w:name="List Table 7 Colorful Accent 6" w:uiPriority="52"/>
+    <w:lsdException w:name="Mention" w:semiHidden="1" w:unhideWhenUsed="1"/>
+    <w:lsdException w:name="Smart Hyperlink" w:semiHidden="1" w:unhideWhenUsed="1"/>
+    <w:lsdException w:name="Hashtag" w:semiHidden="1" w:unhideWhenUsed="1"/>
+    <w:lsdException w:name="Unresolved Mention" w:semiHidden="1" w:unhideWhenUsed="1"/>
+    <w:lsdException w:name="Smart Link" w:semiHidden="1" w:unhideWhenUsed="1"/>
   </w:latentStyles>
   <w:style w:type="paragraph" w:default="1" w:styleId="Normal">
     <w:name w:val="Normal"/>
@@ -24622,7 +24618,7 @@
       </w:tcPr>
     </w:tblStylePr>
   </w:style>
-  <w:style w:type="table" w:styleId="Cuadrculadetablaclara">
+  <w:style w:type="table" w:styleId="Tablaconcuadrculaclara">
     <w:name w:val="Grid Table Light"/>
     <w:basedOn w:val="Tablanormal"/>
     <w:uiPriority w:val="40"/>

</xml_diff>